<commit_message>
feat(mo): reply-brief and petition-for-writ on the model at HEAD; docx gated (743/743, 510/510), latex reported (no break after an in-word slash); closing quote fixed in the petition INPUT, reply contents without a hang, reply last paragraph kept with the closing (fb-595.54.59)
Co-Authored-By: Claude Opus 5.5 <noreply@anthropic.com>
</commit_message>
<xml_diff>
--- a/courts/eighth-circuit/missouri/state/supreme-court/petition-for-writ/usage/OUTPUT-petition-for-writ.docx
+++ b/courts/eighth-circuit/missouri/state/supreme-court/petition-for-writ/usage/OUTPUT-petition-for-writ.docx
@@ -6426,7 +6426,7 @@
         <w:t xml:space="preserve"> </w:t>
       </w:r>
       <w:r>
-        <w:t xml:space="preserve">(stating “[e]very person committed, detained, confined or restrained of his liberty, within this state, for any criminal or supposed criminal matter, or under any pretense whatsoever . . . may prosecute a writ of habeas corpus as herein provided, to inquire into the cause of such confinement or restraint).</w:t>
+        <w:t xml:space="preserve">(stating “[e]very person committed, detained, confined or restrained of his liberty, within this state, for any criminal or supposed criminal matter, or under any pretense whatsoever . . . may prosecute a writ of habeas corpus as herein provided, to inquire into the cause of such confinement or restraint).</w:t>
       </w:r>
     </w:p>
     <w:p>
@@ -6773,16 +6773,7 @@
         <w:t xml:space="preserve"> </w:t>
       </w:r>
       <w:r>
-        <w:t xml:space="preserve">and that the defendant must make the related waivers</w:t>
-      </w:r>
-      <w:r>
-        <w:t xml:space="preserve"> </w:t>
-      </w:r>
-      <w:r>
-        <w:t xml:space="preserve">‘knowing[ly], intelligent[ly], [and] with sufficient awareness of the relevant circumstances and likely consequences.’</w:t>
-      </w:r>
-      <w:r>
-        <w:t xml:space="preserve">” United States v. Ruiz,</w:t>
+        <w:t xml:space="preserve">and that the defendant must make the related waivers ’knowing[ly], intelligent[ly], [and] with sufficient awareness of the relevant circumstances and likely consequences.’” United States v. Ruiz,</w:t>
       </w:r>
       <w:r>
         <w:t xml:space="preserve"> </w:t>
@@ -6854,7 +6845,7 @@
         <w:t xml:space="preserve"> </w:t>
       </w:r>
       <w:r>
-        <w:t xml:space="preserve">his right[s] . . .”</w:t>
+        <w:t xml:space="preserve">his right[s] . . .”</w:t>
       </w:r>
       <w:r>
         <w:t xml:space="preserve"> </w:t>
@@ -6960,7 +6951,7 @@
         <w:t xml:space="preserve"> </w:t>
       </w:r>
       <w:r>
-        <w:t xml:space="preserve">“cannot be waived by the incompetent – by guilty plea or otherwise . . .”</w:t>
+        <w:t xml:space="preserve">“cannot be waived by the incompetent – by guilty plea or otherwise . . .”</w:t>
       </w:r>
       <w:r>
         <w:t xml:space="preserve"> </w:t>
@@ -6980,7 +6971,7 @@
         <w:pStyle w:val="BodyText"/>
       </w:pPr>
       <w:r>
-        <w:t xml:space="preserve">“The entry of a plea of not guilty by reason of insanity . . . presupposes that the defendant is competent to stand trial and to enter a plea.”</w:t>
+        <w:t xml:space="preserve">“The entry of a plea of not guilty by reason of insanity . . . presupposes that the defendant is competent to stand trial and to enter a plea.”</w:t>
       </w:r>
       <w:r>
         <w:t xml:space="preserve"> </w:t>
@@ -7475,7 +7466,7 @@
         <w:t xml:space="preserve"> </w:t>
       </w:r>
       <w:r>
-        <w:t xml:space="preserve">“habeas is . . . the only viable means by which the lawfulness of confinement as a result of the NGRI defense can be challenged.”</w:t>
+        <w:t xml:space="preserve">“habeas is . . . the only viable means by which the lawfulness of confinement as a result of the NGRI defense can be challenged.”</w:t>
       </w:r>
       <w:r>
         <w:t xml:space="preserve"> </w:t>
@@ -7771,13 +7762,13 @@
         <w:t xml:space="preserve"> </w:t>
       </w:r>
       <w:r>
-        <w:t xml:space="preserve">“[A] defendant is not competent to waive post[-]conviction remedies if he . . . is</w:t>
-      </w:r>
-      <w:r>
-        <w:t xml:space="preserve"> </w:t>
-      </w:r>
-      <w:r>
-        <w:t xml:space="preserve">‘suffering from a mental disease, disorder, or defect that may substantially affect his . . . capacity to appreciate his . . . position and make a rational choice with respect to continuing or abandoning further litigation.’</w:t>
+        <w:t xml:space="preserve">“[A] defendant is not competent to waive post[-]conviction remedies if he . . . is</w:t>
+      </w:r>
+      <w:r>
+        <w:t xml:space="preserve"> </w:t>
+      </w:r>
+      <w:r>
+        <w:t xml:space="preserve">‘suffering from a mental disease, disorder, or defect that may substantially affect his . . . capacity to appreciate his . . . position and make a rational choice with respect to continuing or abandoning further litigation.’</w:t>
       </w:r>
       <w:r>
         <w:t xml:space="preserve">”</w:t>
@@ -7804,7 +7795,7 @@
         <w:t xml:space="preserve"> </w:t>
       </w:r>
       <w:r>
-        <w:t xml:space="preserve">“Mental illness prejudices a petitioner if it interferes with or impedes his . . . ability to comply with state procedural requirements, such as pursuing post-conviction relief within a specific time period.”</w:t>
+        <w:t xml:space="preserve">“Mental illness prejudices a petitioner if it interferes with or impedes his . . . ability to comply with state procedural requirements, such as pursuing post-conviction relief within a specific time period.”</w:t>
       </w:r>
       <w:r>
         <w:t xml:space="preserve"> </w:t>
@@ -9512,6 +9503,7 @@
     <w:unhideWhenUsed/>
     <w:qFormat/>
     <w:pPr>
+      <w:keepLines/>
       <w:spacing w:before="0" w:after="130" w:line="299" w:lineRule="exact"/>
     </w:pPr>
     <w:rPr>
@@ -9762,6 +9754,33 @@
     <w:pPr>
       <w:spacing w:before="0" w:after="0" w:line="449" w:lineRule="exact"/>
       <w:ind w:left="2160" w:hanging="720"/>
+    </w:pPr>
+  </w:style>
+  <w:style w:type="paragraph" w:customStyle="1" w:styleId="XdQuoteList1">
+    <w:name w:val="Xd Quote List 1"/>
+    <w:basedOn w:val="Normal"/>
+    <w:qFormat/>
+    <w:pPr>
+      <w:spacing w:before="0" w:after="0" w:line="299" w:lineRule="exact"/>
+      <w:ind w:left="1440" w:right="720" w:hanging="720"/>
+    </w:pPr>
+  </w:style>
+  <w:style w:type="paragraph" w:customStyle="1" w:styleId="XdQuoteList2">
+    <w:name w:val="Xd Quote List 2"/>
+    <w:basedOn w:val="Normal"/>
+    <w:qFormat/>
+    <w:pPr>
+      <w:spacing w:before="0" w:after="0" w:line="299" w:lineRule="exact"/>
+      <w:ind w:left="2160" w:right="720" w:hanging="720"/>
+    </w:pPr>
+  </w:style>
+  <w:style w:type="paragraph" w:customStyle="1" w:styleId="XdQuoteList3">
+    <w:name w:val="Xd Quote List 3"/>
+    <w:basedOn w:val="Normal"/>
+    <w:qFormat/>
+    <w:pPr>
+      <w:spacing w:before="0" w:after="0" w:line="299" w:lineRule="exact"/>
+      <w:ind w:left="2880" w:right="720" w:hanging="720"/>
     </w:pPr>
   </w:style>
   <w:style w:type="paragraph" w:customStyle="1" w:styleId="XdQuoteOnly">

</xml_diff>